<commit_message>
Add board feature masks and rasterization channels
- Move action space definitions under features
- Add river, bridge, and tower-site static masks
- Add board channel definitions and rasterization helpers
- Add debug SVGs for board, tower, and deploy masks
- Wire YOLO match data into initial dynamic board features
</commit_message>
<xml_diff>
--- a/capture/docs/clash_royale_ai_structure_and_implementation.docx
+++ b/capture/docs/clash_royale_ai_structure_and_implementation.docx
@@ -10852,6 +10852,29 @@
     </w:pPr>
     <w:rPr/>
   </w:style>
+  <w:style w:type="paragraph" w:styleId="TableContents">
+    <w:name w:val="Table Contents"/>
+    <w:basedOn w:val="Normal"/>
+    <w:qFormat/>
+    <w:pPr>
+      <w:widowControl w:val="false"/>
+      <w:suppressLineNumbers/>
+    </w:pPr>
+    <w:rPr/>
+  </w:style>
+  <w:style w:type="paragraph" w:styleId="TableHeading">
+    <w:name w:val="Table Heading"/>
+    <w:basedOn w:val="TableContents"/>
+    <w:qFormat/>
+    <w:pPr>
+      <w:suppressLineNumbers/>
+      <w:jc w:val="center"/>
+    </w:pPr>
+    <w:rPr>
+      <w:b/>
+      <w:bCs/>
+    </w:rPr>
+  </w:style>
   <w:style w:type="numbering" w:styleId="NoList" w:default="1">
     <w:name w:val="No List"/>
     <w:uiPriority w:val="99"/>

</xml_diff>